<commit_message>
Add OSPF BDR Broadcast PDF resource for NWT3 curriculum
</commit_message>
<xml_diff>
--- a/3 Klasse/nwt/2026-27_NWT3_01_OSPF_DR_BDR_Broadcast_extended/2026-27_NWT3_01_OSPF_DR_BDR_Broadcast_extended.docx
+++ b/3 Klasse/nwt/2026-27_NWT3_01_OSPF_DR_BDR_Broadcast_extended/2026-27_NWT3_01_OSPF_DR_BDR_Broadcast_extended.docx
@@ -92,6 +92,44 @@
     </w:p>
     <w:p>
       <w:r>
+        <w:lastRenderedPageBreak/>
+        <w:drawing>
+          <wp:inline distT="0" distB="0" distL="0" distR="0" wp14:anchorId="05348BF7" wp14:editId="4BEA2B44">
+            <wp:extent cx="5721644" cy="3378374"/>
+            <wp:effectExtent l="0" t="0" r="0" b="0"/>
+            <wp:docPr id="864435164" name="Picture 1"/>
+            <wp:cNvGraphicFramePr>
+              <a:graphicFrameLocks xmlns:a="http://schemas.openxmlformats.org/drawingml/2006/main" noChangeAspect="1"/>
+            </wp:cNvGraphicFramePr>
+            <a:graphic xmlns:a="http://schemas.openxmlformats.org/drawingml/2006/main">
+              <a:graphicData uri="http://schemas.openxmlformats.org/drawingml/2006/picture">
+                <pic:pic xmlns:pic="http://schemas.openxmlformats.org/drawingml/2006/picture">
+                  <pic:nvPicPr>
+                    <pic:cNvPr id="864435164" name=""/>
+                    <pic:cNvPicPr/>
+                  </pic:nvPicPr>
+                  <pic:blipFill>
+                    <a:blip r:embed="rId8"/>
+                    <a:stretch>
+                      <a:fillRect/>
+                    </a:stretch>
+                  </pic:blipFill>
+                  <pic:spPr>
+                    <a:xfrm>
+                      <a:off x="0" y="0"/>
+                      <a:ext cx="5721644" cy="3378374"/>
+                    </a:xfrm>
+                    <a:prstGeom prst="rect">
+                      <a:avLst/>
+                    </a:prstGeom>
+                  </pic:spPr>
+                </pic:pic>
+              </a:graphicData>
+            </a:graphic>
+          </wp:inline>
+        </w:drawing>
+      </w:r>
+      <w:r>
         <w:rPr>
           <w:noProof/>
         </w:rPr>
@@ -109,7 +147,7 @@
                     <pic:cNvPicPr/>
                   </pic:nvPicPr>
                   <pic:blipFill>
-                    <a:blip r:embed="rId8"/>
+                    <a:blip r:embed="rId9"/>
                     <a:stretch>
                       <a:fillRect/>
                     </a:stretch>
@@ -133,6 +171,1415 @@
             </a:graphic>
           </wp:inline>
         </w:drawing>
+      </w:r>
+    </w:p>
+    <w:p>
+      <w:r>
+        <w:drawing>
+          <wp:inline distT="0" distB="0" distL="0" distR="0" wp14:anchorId="4E7B7FE8" wp14:editId="72E6BA26">
+            <wp:extent cx="5658141" cy="857294"/>
+            <wp:effectExtent l="0" t="0" r="0" b="0"/>
+            <wp:docPr id="525287741" name="Picture 1"/>
+            <wp:cNvGraphicFramePr>
+              <a:graphicFrameLocks xmlns:a="http://schemas.openxmlformats.org/drawingml/2006/main" noChangeAspect="1"/>
+            </wp:cNvGraphicFramePr>
+            <a:graphic xmlns:a="http://schemas.openxmlformats.org/drawingml/2006/main">
+              <a:graphicData uri="http://schemas.openxmlformats.org/drawingml/2006/picture">
+                <pic:pic xmlns:pic="http://schemas.openxmlformats.org/drawingml/2006/picture">
+                  <pic:nvPicPr>
+                    <pic:cNvPr id="525287741" name=""/>
+                    <pic:cNvPicPr/>
+                  </pic:nvPicPr>
+                  <pic:blipFill>
+                    <a:blip r:embed="rId10"/>
+                    <a:stretch>
+                      <a:fillRect/>
+                    </a:stretch>
+                  </pic:blipFill>
+                  <pic:spPr>
+                    <a:xfrm>
+                      <a:off x="0" y="0"/>
+                      <a:ext cx="5658141" cy="857294"/>
+                    </a:xfrm>
+                    <a:prstGeom prst="rect">
+                      <a:avLst/>
+                    </a:prstGeom>
+                  </pic:spPr>
+                </pic:pic>
+              </a:graphicData>
+            </a:graphic>
+          </wp:inline>
+        </w:drawing>
+      </w:r>
+    </w:p>
+    <w:p>
+      <w:r>
+        <w:drawing>
+          <wp:inline distT="0" distB="0" distL="0" distR="0" wp14:anchorId="5A226542" wp14:editId="0246661E">
+            <wp:extent cx="5731510" cy="1101090"/>
+            <wp:effectExtent l="0" t="0" r="2540" b="3810"/>
+            <wp:docPr id="1744367261" name="Picture 1"/>
+            <wp:cNvGraphicFramePr>
+              <a:graphicFrameLocks xmlns:a="http://schemas.openxmlformats.org/drawingml/2006/main" noChangeAspect="1"/>
+            </wp:cNvGraphicFramePr>
+            <a:graphic xmlns:a="http://schemas.openxmlformats.org/drawingml/2006/main">
+              <a:graphicData uri="http://schemas.openxmlformats.org/drawingml/2006/picture">
+                <pic:pic xmlns:pic="http://schemas.openxmlformats.org/drawingml/2006/picture">
+                  <pic:nvPicPr>
+                    <pic:cNvPr id="1744367261" name=""/>
+                    <pic:cNvPicPr/>
+                  </pic:nvPicPr>
+                  <pic:blipFill>
+                    <a:blip r:embed="rId11"/>
+                    <a:stretch>
+                      <a:fillRect/>
+                    </a:stretch>
+                  </pic:blipFill>
+                  <pic:spPr>
+                    <a:xfrm>
+                      <a:off x="0" y="0"/>
+                      <a:ext cx="5731510" cy="1101090"/>
+                    </a:xfrm>
+                    <a:prstGeom prst="rect">
+                      <a:avLst/>
+                    </a:prstGeom>
+                  </pic:spPr>
+                </pic:pic>
+              </a:graphicData>
+            </a:graphic>
+          </wp:inline>
+        </w:drawing>
+      </w:r>
+    </w:p>
+    <w:p>
+      <w:r>
+        <w:lastRenderedPageBreak/>
+        <w:drawing>
+          <wp:inline distT="0" distB="0" distL="0" distR="0" wp14:anchorId="7BF71E96" wp14:editId="525D668A">
+            <wp:extent cx="5296172" cy="2914800"/>
+            <wp:effectExtent l="0" t="0" r="0" b="0"/>
+            <wp:docPr id="1132454064" name="Picture 1"/>
+            <wp:cNvGraphicFramePr>
+              <a:graphicFrameLocks xmlns:a="http://schemas.openxmlformats.org/drawingml/2006/main" noChangeAspect="1"/>
+            </wp:cNvGraphicFramePr>
+            <a:graphic xmlns:a="http://schemas.openxmlformats.org/drawingml/2006/main">
+              <a:graphicData uri="http://schemas.openxmlformats.org/drawingml/2006/picture">
+                <pic:pic xmlns:pic="http://schemas.openxmlformats.org/drawingml/2006/picture">
+                  <pic:nvPicPr>
+                    <pic:cNvPr id="1132454064" name=""/>
+                    <pic:cNvPicPr/>
+                  </pic:nvPicPr>
+                  <pic:blipFill>
+                    <a:blip r:embed="rId12"/>
+                    <a:stretch>
+                      <a:fillRect/>
+                    </a:stretch>
+                  </pic:blipFill>
+                  <pic:spPr>
+                    <a:xfrm>
+                      <a:off x="0" y="0"/>
+                      <a:ext cx="5296172" cy="2914800"/>
+                    </a:xfrm>
+                    <a:prstGeom prst="rect">
+                      <a:avLst/>
+                    </a:prstGeom>
+                  </pic:spPr>
+                </pic:pic>
+              </a:graphicData>
+            </a:graphic>
+          </wp:inline>
+        </w:drawing>
+      </w:r>
+    </w:p>
+    <w:p>
+      <w:r>
+        <w:drawing>
+          <wp:inline distT="0" distB="0" distL="0" distR="0" wp14:anchorId="73303EB0" wp14:editId="1CE1D309">
+            <wp:extent cx="4038808" cy="3149762"/>
+            <wp:effectExtent l="0" t="0" r="0" b="0"/>
+            <wp:docPr id="1582041166" name="Picture 1"/>
+            <wp:cNvGraphicFramePr>
+              <a:graphicFrameLocks xmlns:a="http://schemas.openxmlformats.org/drawingml/2006/main" noChangeAspect="1"/>
+            </wp:cNvGraphicFramePr>
+            <a:graphic xmlns:a="http://schemas.openxmlformats.org/drawingml/2006/main">
+              <a:graphicData uri="http://schemas.openxmlformats.org/drawingml/2006/picture">
+                <pic:pic xmlns:pic="http://schemas.openxmlformats.org/drawingml/2006/picture">
+                  <pic:nvPicPr>
+                    <pic:cNvPr id="1582041166" name=""/>
+                    <pic:cNvPicPr/>
+                  </pic:nvPicPr>
+                  <pic:blipFill>
+                    <a:blip r:embed="rId13"/>
+                    <a:stretch>
+                      <a:fillRect/>
+                    </a:stretch>
+                  </pic:blipFill>
+                  <pic:spPr>
+                    <a:xfrm>
+                      <a:off x="0" y="0"/>
+                      <a:ext cx="4038808" cy="3149762"/>
+                    </a:xfrm>
+                    <a:prstGeom prst="rect">
+                      <a:avLst/>
+                    </a:prstGeom>
+                  </pic:spPr>
+                </pic:pic>
+              </a:graphicData>
+            </a:graphic>
+          </wp:inline>
+        </w:drawing>
+      </w:r>
+    </w:p>
+    <w:p>
+      <w:r>
+        <w:lastRenderedPageBreak/>
+        <w:drawing>
+          <wp:inline distT="0" distB="0" distL="0" distR="0" wp14:anchorId="7D5F8AD3" wp14:editId="281F8ADE">
+            <wp:extent cx="5731510" cy="3542665"/>
+            <wp:effectExtent l="0" t="0" r="2540" b="635"/>
+            <wp:docPr id="919075791" name="Picture 1"/>
+            <wp:cNvGraphicFramePr>
+              <a:graphicFrameLocks xmlns:a="http://schemas.openxmlformats.org/drawingml/2006/main" noChangeAspect="1"/>
+            </wp:cNvGraphicFramePr>
+            <a:graphic xmlns:a="http://schemas.openxmlformats.org/drawingml/2006/main">
+              <a:graphicData uri="http://schemas.openxmlformats.org/drawingml/2006/picture">
+                <pic:pic xmlns:pic="http://schemas.openxmlformats.org/drawingml/2006/picture">
+                  <pic:nvPicPr>
+                    <pic:cNvPr id="919075791" name=""/>
+                    <pic:cNvPicPr/>
+                  </pic:nvPicPr>
+                  <pic:blipFill>
+                    <a:blip r:embed="rId14"/>
+                    <a:stretch>
+                      <a:fillRect/>
+                    </a:stretch>
+                  </pic:blipFill>
+                  <pic:spPr>
+                    <a:xfrm>
+                      <a:off x="0" y="0"/>
+                      <a:ext cx="5731510" cy="3542665"/>
+                    </a:xfrm>
+                    <a:prstGeom prst="rect">
+                      <a:avLst/>
+                    </a:prstGeom>
+                  </pic:spPr>
+                </pic:pic>
+              </a:graphicData>
+            </a:graphic>
+          </wp:inline>
+        </w:drawing>
+      </w:r>
+    </w:p>
+    <w:p>
+      <w:r>
+        <w:rPr>
+          <w:noProof/>
+        </w:rPr>
+        <w:drawing>
+          <wp:inline distT="0" distB="0" distL="0" distR="0" wp14:anchorId="6447985A" wp14:editId="4AE77EC3">
+            <wp:extent cx="5731510" cy="2975610"/>
+            <wp:effectExtent l="0" t="0" r="2540" b="0"/>
+            <wp:docPr id="1953845156" name="Picture 1"/>
+            <wp:cNvGraphicFramePr>
+              <a:graphicFrameLocks xmlns:a="http://schemas.openxmlformats.org/drawingml/2006/main" noChangeAspect="1"/>
+            </wp:cNvGraphicFramePr>
+            <a:graphic xmlns:a="http://schemas.openxmlformats.org/drawingml/2006/main">
+              <a:graphicData uri="http://schemas.openxmlformats.org/drawingml/2006/picture">
+                <pic:pic xmlns:pic="http://schemas.openxmlformats.org/drawingml/2006/picture">
+                  <pic:nvPicPr>
+                    <pic:cNvPr id="1953845156" name=""/>
+                    <pic:cNvPicPr/>
+                  </pic:nvPicPr>
+                  <pic:blipFill>
+                    <a:blip r:embed="rId15"/>
+                    <a:stretch>
+                      <a:fillRect/>
+                    </a:stretch>
+                  </pic:blipFill>
+                  <pic:spPr>
+                    <a:xfrm>
+                      <a:off x="0" y="0"/>
+                      <a:ext cx="5731510" cy="2975610"/>
+                    </a:xfrm>
+                    <a:prstGeom prst="rect">
+                      <a:avLst/>
+                    </a:prstGeom>
+                  </pic:spPr>
+                </pic:pic>
+              </a:graphicData>
+            </a:graphic>
+          </wp:inline>
+        </w:drawing>
+      </w:r>
+    </w:p>
+    <w:p>
+      <w:r>
+        <w:drawing>
+          <wp:inline distT="0" distB="0" distL="0" distR="0" wp14:anchorId="0EE9D3DC" wp14:editId="3B715C4A">
+            <wp:extent cx="5283472" cy="958899"/>
+            <wp:effectExtent l="0" t="0" r="0" b="0"/>
+            <wp:docPr id="1593788201" name="Picture 1"/>
+            <wp:cNvGraphicFramePr>
+              <a:graphicFrameLocks xmlns:a="http://schemas.openxmlformats.org/drawingml/2006/main" noChangeAspect="1"/>
+            </wp:cNvGraphicFramePr>
+            <a:graphic xmlns:a="http://schemas.openxmlformats.org/drawingml/2006/main">
+              <a:graphicData uri="http://schemas.openxmlformats.org/drawingml/2006/picture">
+                <pic:pic xmlns:pic="http://schemas.openxmlformats.org/drawingml/2006/picture">
+                  <pic:nvPicPr>
+                    <pic:cNvPr id="1593788201" name=""/>
+                    <pic:cNvPicPr/>
+                  </pic:nvPicPr>
+                  <pic:blipFill>
+                    <a:blip r:embed="rId16"/>
+                    <a:stretch>
+                      <a:fillRect/>
+                    </a:stretch>
+                  </pic:blipFill>
+                  <pic:spPr>
+                    <a:xfrm>
+                      <a:off x="0" y="0"/>
+                      <a:ext cx="5283472" cy="958899"/>
+                    </a:xfrm>
+                    <a:prstGeom prst="rect">
+                      <a:avLst/>
+                    </a:prstGeom>
+                  </pic:spPr>
+                </pic:pic>
+              </a:graphicData>
+            </a:graphic>
+          </wp:inline>
+        </w:drawing>
+      </w:r>
+    </w:p>
+    <w:p>
+      <w:r>
+        <w:lastRenderedPageBreak/>
+        <w:drawing>
+          <wp:inline distT="0" distB="0" distL="0" distR="0" wp14:anchorId="1D78A15D" wp14:editId="37D3383D">
+            <wp:extent cx="4915153" cy="2000353"/>
+            <wp:effectExtent l="0" t="0" r="0" b="0"/>
+            <wp:docPr id="684789227" name="Picture 1"/>
+            <wp:cNvGraphicFramePr>
+              <a:graphicFrameLocks xmlns:a="http://schemas.openxmlformats.org/drawingml/2006/main" noChangeAspect="1"/>
+            </wp:cNvGraphicFramePr>
+            <a:graphic xmlns:a="http://schemas.openxmlformats.org/drawingml/2006/main">
+              <a:graphicData uri="http://schemas.openxmlformats.org/drawingml/2006/picture">
+                <pic:pic xmlns:pic="http://schemas.openxmlformats.org/drawingml/2006/picture">
+                  <pic:nvPicPr>
+                    <pic:cNvPr id="684789227" name=""/>
+                    <pic:cNvPicPr/>
+                  </pic:nvPicPr>
+                  <pic:blipFill>
+                    <a:blip r:embed="rId17"/>
+                    <a:stretch>
+                      <a:fillRect/>
+                    </a:stretch>
+                  </pic:blipFill>
+                  <pic:spPr>
+                    <a:xfrm>
+                      <a:off x="0" y="0"/>
+                      <a:ext cx="4915153" cy="2000353"/>
+                    </a:xfrm>
+                    <a:prstGeom prst="rect">
+                      <a:avLst/>
+                    </a:prstGeom>
+                  </pic:spPr>
+                </pic:pic>
+              </a:graphicData>
+            </a:graphic>
+          </wp:inline>
+        </w:drawing>
+      </w:r>
+    </w:p>
+    <w:p>
+      <w:r>
+        <w:drawing>
+          <wp:inline distT="0" distB="0" distL="0" distR="0" wp14:anchorId="36D2616F" wp14:editId="3FF0AB4D">
+            <wp:extent cx="4902452" cy="1511378"/>
+            <wp:effectExtent l="0" t="0" r="0" b="0"/>
+            <wp:docPr id="577301715" name="Picture 1"/>
+            <wp:cNvGraphicFramePr>
+              <a:graphicFrameLocks xmlns:a="http://schemas.openxmlformats.org/drawingml/2006/main" noChangeAspect="1"/>
+            </wp:cNvGraphicFramePr>
+            <a:graphic xmlns:a="http://schemas.openxmlformats.org/drawingml/2006/main">
+              <a:graphicData uri="http://schemas.openxmlformats.org/drawingml/2006/picture">
+                <pic:pic xmlns:pic="http://schemas.openxmlformats.org/drawingml/2006/picture">
+                  <pic:nvPicPr>
+                    <pic:cNvPr id="577301715" name=""/>
+                    <pic:cNvPicPr/>
+                  </pic:nvPicPr>
+                  <pic:blipFill>
+                    <a:blip r:embed="rId18"/>
+                    <a:stretch>
+                      <a:fillRect/>
+                    </a:stretch>
+                  </pic:blipFill>
+                  <pic:spPr>
+                    <a:xfrm>
+                      <a:off x="0" y="0"/>
+                      <a:ext cx="4902452" cy="1511378"/>
+                    </a:xfrm>
+                    <a:prstGeom prst="rect">
+                      <a:avLst/>
+                    </a:prstGeom>
+                  </pic:spPr>
+                </pic:pic>
+              </a:graphicData>
+            </a:graphic>
+          </wp:inline>
+        </w:drawing>
+      </w:r>
+    </w:p>
+    <w:p>
+      <w:r>
+        <w:drawing>
+          <wp:inline distT="0" distB="0" distL="0" distR="0" wp14:anchorId="38FC88AB" wp14:editId="4B13E482">
+            <wp:extent cx="5207268" cy="819192"/>
+            <wp:effectExtent l="0" t="0" r="0" b="0"/>
+            <wp:docPr id="901936581" name="Picture 1"/>
+            <wp:cNvGraphicFramePr>
+              <a:graphicFrameLocks xmlns:a="http://schemas.openxmlformats.org/drawingml/2006/main" noChangeAspect="1"/>
+            </wp:cNvGraphicFramePr>
+            <a:graphic xmlns:a="http://schemas.openxmlformats.org/drawingml/2006/main">
+              <a:graphicData uri="http://schemas.openxmlformats.org/drawingml/2006/picture">
+                <pic:pic xmlns:pic="http://schemas.openxmlformats.org/drawingml/2006/picture">
+                  <pic:nvPicPr>
+                    <pic:cNvPr id="901936581" name=""/>
+                    <pic:cNvPicPr/>
+                  </pic:nvPicPr>
+                  <pic:blipFill>
+                    <a:blip r:embed="rId19"/>
+                    <a:stretch>
+                      <a:fillRect/>
+                    </a:stretch>
+                  </pic:blipFill>
+                  <pic:spPr>
+                    <a:xfrm>
+                      <a:off x="0" y="0"/>
+                      <a:ext cx="5207268" cy="819192"/>
+                    </a:xfrm>
+                    <a:prstGeom prst="rect">
+                      <a:avLst/>
+                    </a:prstGeom>
+                  </pic:spPr>
+                </pic:pic>
+              </a:graphicData>
+            </a:graphic>
+          </wp:inline>
+        </w:drawing>
+      </w:r>
+    </w:p>
+    <w:p>
+      <w:r>
+        <w:t>====================================================================</w:t>
+      </w:r>
+    </w:p>
+    <w:p>
+      <w:r>
+        <w:t>OSPF ERWEITERTE TOPOLOGIE - KONFIGURATIONSSKRIPTE</w:t>
+      </w:r>
+    </w:p>
+    <w:p>
+      <w:r>
+        <w:t>====================================================================</w:t>
+      </w:r>
+    </w:p>
+    <w:p/>
+    <w:p>
+      <w:r>
+        <w:t>--------------------------------------------------------------------</w:t>
+      </w:r>
+    </w:p>
+    <w:p>
+      <w:r>
+        <w:t>ROUTER 1 (IOU1)</w:t>
+      </w:r>
+    </w:p>
+    <w:p>
+      <w:r>
+        <w:t>--------------------------------------------------------------------</w:t>
+      </w:r>
+    </w:p>
+    <w:p>
+      <w:r>
+        <w:t>enable</w:t>
+      </w:r>
+    </w:p>
+    <w:p>
+      <w:r>
+        <w:t>configure terminal</w:t>
+      </w:r>
+    </w:p>
+    <w:p>
+      <w:r>
+        <w:t>hostname IOU1</w:t>
+      </w:r>
+    </w:p>
+    <w:p/>
+    <w:p>
+      <w:r>
+        <w:t>interface Loopback0</w:t>
+      </w:r>
+    </w:p>
+    <w:p>
+      <w:r>
+        <w:t xml:space="preserve"> </w:t>
+      </w:r>
+      <w:proofErr w:type="spellStart"/>
+      <w:r>
+        <w:t>ip</w:t>
+      </w:r>
+      <w:proofErr w:type="spellEnd"/>
+      <w:r>
+        <w:t xml:space="preserve"> address 10.1.11.1 255.255.255.255</w:t>
+      </w:r>
+    </w:p>
+    <w:p>
+      <w:r>
+        <w:lastRenderedPageBreak/>
+        <w:t xml:space="preserve"> no shutdown</w:t>
+      </w:r>
+    </w:p>
+    <w:p/>
+    <w:p>
+      <w:r>
+        <w:t>interface GigabitEthernet0/0</w:t>
+      </w:r>
+    </w:p>
+    <w:p>
+      <w:r>
+        <w:t xml:space="preserve"> </w:t>
+      </w:r>
+      <w:proofErr w:type="spellStart"/>
+      <w:r>
+        <w:t>ip</w:t>
+      </w:r>
+      <w:proofErr w:type="spellEnd"/>
+      <w:r>
+        <w:t xml:space="preserve"> address 10.1.1.1 255.255.255.0</w:t>
+      </w:r>
+    </w:p>
+    <w:p>
+      <w:r>
+        <w:t xml:space="preserve"> </w:t>
+      </w:r>
+      <w:proofErr w:type="spellStart"/>
+      <w:r>
+        <w:t>ip</w:t>
+      </w:r>
+      <w:proofErr w:type="spellEnd"/>
+      <w:r>
+        <w:t xml:space="preserve"> </w:t>
+      </w:r>
+      <w:proofErr w:type="spellStart"/>
+      <w:r>
+        <w:t>ospf</w:t>
+      </w:r>
+      <w:proofErr w:type="spellEnd"/>
+      <w:r>
+        <w:t xml:space="preserve"> priority 1</w:t>
+      </w:r>
+    </w:p>
+    <w:p>
+      <w:r>
+        <w:t xml:space="preserve"> no shutdown</w:t>
+      </w:r>
+    </w:p>
+    <w:p/>
+    <w:p>
+      <w:r>
+        <w:t xml:space="preserve">router </w:t>
+      </w:r>
+      <w:proofErr w:type="spellStart"/>
+      <w:r>
+        <w:t>ospf</w:t>
+      </w:r>
+      <w:proofErr w:type="spellEnd"/>
+      <w:r>
+        <w:t xml:space="preserve"> 1</w:t>
+      </w:r>
+    </w:p>
+    <w:p>
+      <w:r>
+        <w:t xml:space="preserve"> router-id 1.1.1.1</w:t>
+      </w:r>
+    </w:p>
+    <w:p>
+      <w:r>
+        <w:t xml:space="preserve"> network 10.1.1.0 0.0.0.255 area 0</w:t>
+      </w:r>
+    </w:p>
+    <w:p>
+      <w:r>
+        <w:t xml:space="preserve"> network 10.1.11.1 0.0.0.0 area 0</w:t>
+      </w:r>
+    </w:p>
+    <w:p>
+      <w:r>
+        <w:t>end</w:t>
+      </w:r>
+    </w:p>
+    <w:p>
+      <w:r>
+        <w:t>copy running-config startup-config</w:t>
+      </w:r>
+    </w:p>
+    <w:p/>
+    <w:p/>
+    <w:p>
+      <w:r>
+        <w:t>--------------------------------------------------------------------</w:t>
+      </w:r>
+    </w:p>
+    <w:p>
+      <w:r>
+        <w:t>ROUTER 2 (IOU2)</w:t>
+      </w:r>
+    </w:p>
+    <w:p>
+      <w:r>
+        <w:t>--------------------------------------------------------------------</w:t>
+      </w:r>
+    </w:p>
+    <w:p>
+      <w:r>
+        <w:t>enable</w:t>
+      </w:r>
+    </w:p>
+    <w:p>
+      <w:r>
+        <w:t>configure terminal</w:t>
+      </w:r>
+    </w:p>
+    <w:p>
+      <w:r>
+        <w:t>hostname IOU2</w:t>
+      </w:r>
+    </w:p>
+    <w:p/>
+    <w:p>
+      <w:r>
+        <w:t>interface Loopback0</w:t>
+      </w:r>
+    </w:p>
+    <w:p>
+      <w:r>
+        <w:t xml:space="preserve"> </w:t>
+      </w:r>
+      <w:proofErr w:type="spellStart"/>
+      <w:r>
+        <w:t>ip</w:t>
+      </w:r>
+      <w:proofErr w:type="spellEnd"/>
+      <w:r>
+        <w:t xml:space="preserve"> address 10.1.22.1 255.255.255.255</w:t>
+      </w:r>
+    </w:p>
+    <w:p>
+      <w:r>
+        <w:t xml:space="preserve"> no shutdown</w:t>
+      </w:r>
+    </w:p>
+    <w:p/>
+    <w:p>
+      <w:r>
+        <w:t>interface GigabitEthernet0/0</w:t>
+      </w:r>
+    </w:p>
+    <w:p>
+      <w:r>
+        <w:t xml:space="preserve"> </w:t>
+      </w:r>
+      <w:proofErr w:type="spellStart"/>
+      <w:r>
+        <w:t>ip</w:t>
+      </w:r>
+      <w:proofErr w:type="spellEnd"/>
+      <w:r>
+        <w:t xml:space="preserve"> address 10.1.1.2 255.255.255.0</w:t>
+      </w:r>
+    </w:p>
+    <w:p>
+      <w:r>
+        <w:lastRenderedPageBreak/>
+        <w:t xml:space="preserve"> </w:t>
+      </w:r>
+      <w:proofErr w:type="spellStart"/>
+      <w:r>
+        <w:t>ip</w:t>
+      </w:r>
+      <w:proofErr w:type="spellEnd"/>
+      <w:r>
+        <w:t xml:space="preserve"> </w:t>
+      </w:r>
+      <w:proofErr w:type="spellStart"/>
+      <w:r>
+        <w:t>ospf</w:t>
+      </w:r>
+      <w:proofErr w:type="spellEnd"/>
+      <w:r>
+        <w:t xml:space="preserve"> priority 1</w:t>
+      </w:r>
+    </w:p>
+    <w:p>
+      <w:r>
+        <w:t xml:space="preserve"> no shutdown</w:t>
+      </w:r>
+    </w:p>
+    <w:p/>
+    <w:p>
+      <w:r>
+        <w:t>interface Serial0/3/0</w:t>
+      </w:r>
+    </w:p>
+    <w:p>
+      <w:r>
+        <w:t xml:space="preserve"> </w:t>
+      </w:r>
+      <w:proofErr w:type="spellStart"/>
+      <w:r>
+        <w:t>ip</w:t>
+      </w:r>
+      <w:proofErr w:type="spellEnd"/>
+      <w:r>
+        <w:t xml:space="preserve"> address 10.99.1.1 255.255.255.252</w:t>
+      </w:r>
+    </w:p>
+    <w:p>
+      <w:r>
+        <w:t xml:space="preserve"> clock rate 64000</w:t>
+      </w:r>
+    </w:p>
+    <w:p>
+      <w:r>
+        <w:t xml:space="preserve"> no shutdown</w:t>
+      </w:r>
+    </w:p>
+    <w:p/>
+    <w:p>
+      <w:r>
+        <w:t xml:space="preserve">router </w:t>
+      </w:r>
+      <w:proofErr w:type="spellStart"/>
+      <w:r>
+        <w:t>ospf</w:t>
+      </w:r>
+      <w:proofErr w:type="spellEnd"/>
+      <w:r>
+        <w:t xml:space="preserve"> 1</w:t>
+      </w:r>
+    </w:p>
+    <w:p>
+      <w:r>
+        <w:t xml:space="preserve"> router-id 2.2.2.2</w:t>
+      </w:r>
+    </w:p>
+    <w:p>
+      <w:r>
+        <w:t xml:space="preserve"> network 10.1.1.0 0.0.0.255 area 0</w:t>
+      </w:r>
+    </w:p>
+    <w:p>
+      <w:r>
+        <w:t xml:space="preserve"> network 10.99.1.0 0.0.0.3 area 0</w:t>
+      </w:r>
+    </w:p>
+    <w:p>
+      <w:r>
+        <w:t xml:space="preserve"> network 10.1.22.1 0.0.0.0 area 0</w:t>
+      </w:r>
+    </w:p>
+    <w:p>
+      <w:r>
+        <w:t>end</w:t>
+      </w:r>
+    </w:p>
+    <w:p>
+      <w:r>
+        <w:t>copy running-config startup-config</w:t>
+      </w:r>
+    </w:p>
+    <w:p/>
+    <w:p/>
+    <w:p>
+      <w:r>
+        <w:t>--------------------------------------------------------------------</w:t>
+      </w:r>
+    </w:p>
+    <w:p>
+      <w:r>
+        <w:t>ROUTER 3 (IOU3)</w:t>
+      </w:r>
+    </w:p>
+    <w:p>
+      <w:r>
+        <w:t>--------------------------------------------------------------------</w:t>
+      </w:r>
+    </w:p>
+    <w:p>
+      <w:r>
+        <w:t>enable</w:t>
+      </w:r>
+    </w:p>
+    <w:p>
+      <w:r>
+        <w:t>configure terminal</w:t>
+      </w:r>
+    </w:p>
+    <w:p>
+      <w:r>
+        <w:t>hostname IOU3</w:t>
+      </w:r>
+    </w:p>
+    <w:p/>
+    <w:p>
+      <w:r>
+        <w:t>interface Loopback0</w:t>
+      </w:r>
+    </w:p>
+    <w:p>
+      <w:r>
+        <w:t xml:space="preserve"> </w:t>
+      </w:r>
+      <w:proofErr w:type="spellStart"/>
+      <w:r>
+        <w:t>ip</w:t>
+      </w:r>
+      <w:proofErr w:type="spellEnd"/>
+      <w:r>
+        <w:t xml:space="preserve"> address 10.1.33.1 255.255.255.255</w:t>
+      </w:r>
+    </w:p>
+    <w:p>
+      <w:r>
+        <w:t xml:space="preserve"> no shutdown</w:t>
+      </w:r>
+    </w:p>
+    <w:p/>
+    <w:p>
+      <w:r>
+        <w:lastRenderedPageBreak/>
+        <w:t>interface GigabitEthernet0/0</w:t>
+      </w:r>
+    </w:p>
+    <w:p>
+      <w:r>
+        <w:t xml:space="preserve"> </w:t>
+      </w:r>
+      <w:proofErr w:type="spellStart"/>
+      <w:r>
+        <w:t>ip</w:t>
+      </w:r>
+      <w:proofErr w:type="spellEnd"/>
+      <w:r>
+        <w:t xml:space="preserve"> address 10.1.1.3 255.255.255.0</w:t>
+      </w:r>
+    </w:p>
+    <w:p>
+      <w:r>
+        <w:t xml:space="preserve"> </w:t>
+      </w:r>
+      <w:proofErr w:type="spellStart"/>
+      <w:r>
+        <w:t>ip</w:t>
+      </w:r>
+      <w:proofErr w:type="spellEnd"/>
+      <w:r>
+        <w:t xml:space="preserve"> </w:t>
+      </w:r>
+      <w:proofErr w:type="spellStart"/>
+      <w:r>
+        <w:t>ospf</w:t>
+      </w:r>
+      <w:proofErr w:type="spellEnd"/>
+      <w:r>
+        <w:t xml:space="preserve"> priority 1</w:t>
+      </w:r>
+    </w:p>
+    <w:p>
+      <w:r>
+        <w:t xml:space="preserve"> no shutdown</w:t>
+      </w:r>
+    </w:p>
+    <w:p/>
+    <w:p>
+      <w:r>
+        <w:t xml:space="preserve">router </w:t>
+      </w:r>
+      <w:proofErr w:type="spellStart"/>
+      <w:r>
+        <w:t>ospf</w:t>
+      </w:r>
+      <w:proofErr w:type="spellEnd"/>
+      <w:r>
+        <w:t xml:space="preserve"> 1</w:t>
+      </w:r>
+    </w:p>
+    <w:p>
+      <w:r>
+        <w:t xml:space="preserve"> router-id 3.3.3.3</w:t>
+      </w:r>
+    </w:p>
+    <w:p>
+      <w:r>
+        <w:t xml:space="preserve"> network 10.1.1.0 0.0.0.255 area 0</w:t>
+      </w:r>
+    </w:p>
+    <w:p>
+      <w:r>
+        <w:t xml:space="preserve"> network 10.1.33.1 0.0.0.0 area 0</w:t>
+      </w:r>
+    </w:p>
+    <w:p>
+      <w:r>
+        <w:t>end</w:t>
+      </w:r>
+    </w:p>
+    <w:p>
+      <w:r>
+        <w:t>copy running-config startup-config</w:t>
+      </w:r>
+    </w:p>
+    <w:p/>
+    <w:p/>
+    <w:p>
+      <w:r>
+        <w:t>--------------------------------------------------------------------</w:t>
+      </w:r>
+    </w:p>
+    <w:p>
+      <w:r>
+        <w:t>ROUTER 4 (IOU4)</w:t>
+      </w:r>
+    </w:p>
+    <w:p>
+      <w:r>
+        <w:t>--------------------------------------------------------------------</w:t>
+      </w:r>
+    </w:p>
+    <w:p>
+      <w:r>
+        <w:t>enable</w:t>
+      </w:r>
+    </w:p>
+    <w:p>
+      <w:r>
+        <w:t>configure terminal</w:t>
+      </w:r>
+    </w:p>
+    <w:p>
+      <w:r>
+        <w:t>hostname IOU4</w:t>
+      </w:r>
+    </w:p>
+    <w:p/>
+    <w:p>
+      <w:r>
+        <w:t>interface Loopback0</w:t>
+      </w:r>
+    </w:p>
+    <w:p>
+      <w:r>
+        <w:t xml:space="preserve"> </w:t>
+      </w:r>
+      <w:proofErr w:type="spellStart"/>
+      <w:r>
+        <w:t>ip</w:t>
+      </w:r>
+      <w:proofErr w:type="spellEnd"/>
+      <w:r>
+        <w:t xml:space="preserve"> address 10.1.44.1 255.255.255.255</w:t>
+      </w:r>
+    </w:p>
+    <w:p>
+      <w:r>
+        <w:t xml:space="preserve"> no shutdown</w:t>
+      </w:r>
+    </w:p>
+    <w:p/>
+    <w:p>
+      <w:r>
+        <w:t>interface GigabitEthernet0/0</w:t>
+      </w:r>
+    </w:p>
+    <w:p>
+      <w:r>
+        <w:t xml:space="preserve"> </w:t>
+      </w:r>
+      <w:proofErr w:type="spellStart"/>
+      <w:r>
+        <w:t>ip</w:t>
+      </w:r>
+      <w:proofErr w:type="spellEnd"/>
+      <w:r>
+        <w:t xml:space="preserve"> address 10.1.1.4 255.255.255.0</w:t>
+      </w:r>
+    </w:p>
+    <w:p>
+      <w:r>
+        <w:t xml:space="preserve"> </w:t>
+      </w:r>
+      <w:proofErr w:type="spellStart"/>
+      <w:r>
+        <w:t>ip</w:t>
+      </w:r>
+      <w:proofErr w:type="spellEnd"/>
+      <w:r>
+        <w:t xml:space="preserve"> </w:t>
+      </w:r>
+      <w:proofErr w:type="spellStart"/>
+      <w:r>
+        <w:t>ospf</w:t>
+      </w:r>
+      <w:proofErr w:type="spellEnd"/>
+      <w:r>
+        <w:t xml:space="preserve"> priority 1</w:t>
+      </w:r>
+    </w:p>
+    <w:p>
+      <w:r>
+        <w:t xml:space="preserve"> no shutdown</w:t>
+      </w:r>
+    </w:p>
+    <w:p/>
+    <w:p>
+      <w:r>
+        <w:t xml:space="preserve">router </w:t>
+      </w:r>
+      <w:proofErr w:type="spellStart"/>
+      <w:r>
+        <w:t>ospf</w:t>
+      </w:r>
+      <w:proofErr w:type="spellEnd"/>
+      <w:r>
+        <w:t xml:space="preserve"> 1</w:t>
+      </w:r>
+    </w:p>
+    <w:p>
+      <w:r>
+        <w:t xml:space="preserve"> router-id 4.4.4.4</w:t>
+      </w:r>
+    </w:p>
+    <w:p>
+      <w:r>
+        <w:t xml:space="preserve"> network 10.1.1.0 0.0.0.255 area 0</w:t>
+      </w:r>
+    </w:p>
+    <w:p>
+      <w:r>
+        <w:t xml:space="preserve"> network 10.1.44.1 0.0.0.0 area 0</w:t>
+      </w:r>
+    </w:p>
+    <w:p>
+      <w:r>
+        <w:t>end</w:t>
+      </w:r>
+    </w:p>
+    <w:p>
+      <w:r>
+        <w:t>copy running-config startup-config</w:t>
+      </w:r>
+    </w:p>
+    <w:p/>
+    <w:p/>
+    <w:p>
+      <w:r>
+        <w:t>--------------------------------------------------------------------</w:t>
+      </w:r>
+    </w:p>
+    <w:p>
+      <w:r>
+        <w:t>ROUTER 6 (IOU6)</w:t>
+      </w:r>
+    </w:p>
+    <w:p>
+      <w:r>
+        <w:t>--------------------------------------------------------------------</w:t>
+      </w:r>
+    </w:p>
+    <w:p>
+      <w:r>
+        <w:t>enable</w:t>
+      </w:r>
+    </w:p>
+    <w:p>
+      <w:r>
+        <w:t>configure terminal</w:t>
+      </w:r>
+    </w:p>
+    <w:p>
+      <w:r>
+        <w:t>hostname IOU6</w:t>
+      </w:r>
+    </w:p>
+    <w:p/>
+    <w:p>
+      <w:r>
+        <w:t>interface Loopback0</w:t>
+      </w:r>
+    </w:p>
+    <w:p>
+      <w:r>
+        <w:t xml:space="preserve"> </w:t>
+      </w:r>
+      <w:proofErr w:type="spellStart"/>
+      <w:r>
+        <w:t>ip</w:t>
+      </w:r>
+      <w:proofErr w:type="spellEnd"/>
+      <w:r>
+        <w:t xml:space="preserve"> address 10.1.66.1 255.255.255.255</w:t>
+      </w:r>
+    </w:p>
+    <w:p>
+      <w:r>
+        <w:t xml:space="preserve"> no shutdown</w:t>
+      </w:r>
+    </w:p>
+    <w:p/>
+    <w:p>
+      <w:r>
+        <w:t>interface Serial0/3/0</w:t>
+      </w:r>
+    </w:p>
+    <w:p>
+      <w:r>
+        <w:t xml:space="preserve"> </w:t>
+      </w:r>
+      <w:proofErr w:type="spellStart"/>
+      <w:r>
+        <w:t>ip</w:t>
+      </w:r>
+      <w:proofErr w:type="spellEnd"/>
+      <w:r>
+        <w:t xml:space="preserve"> address 10.99.1.2 255.255.255.252</w:t>
+      </w:r>
+    </w:p>
+    <w:p>
+      <w:r>
+        <w:t xml:space="preserve"> no shutdown</w:t>
+      </w:r>
+    </w:p>
+    <w:p/>
+    <w:p>
+      <w:r>
+        <w:t>interface Serial0/3/1</w:t>
+      </w:r>
+    </w:p>
+    <w:p>
+      <w:r>
+        <w:t xml:space="preserve"> </w:t>
+      </w:r>
+      <w:proofErr w:type="spellStart"/>
+      <w:r>
+        <w:t>ip</w:t>
+      </w:r>
+      <w:proofErr w:type="spellEnd"/>
+      <w:r>
+        <w:t xml:space="preserve"> address 10.99.2.1 255.255.255.252</w:t>
+      </w:r>
+    </w:p>
+    <w:p>
+      <w:r>
+        <w:t xml:space="preserve"> clock rate 64000</w:t>
+      </w:r>
+    </w:p>
+    <w:p>
+      <w:r>
+        <w:t xml:space="preserve"> no shutdown</w:t>
+      </w:r>
+    </w:p>
+    <w:p/>
+    <w:p>
+      <w:r>
+        <w:t xml:space="preserve">router </w:t>
+      </w:r>
+      <w:proofErr w:type="spellStart"/>
+      <w:r>
+        <w:t>ospf</w:t>
+      </w:r>
+      <w:proofErr w:type="spellEnd"/>
+      <w:r>
+        <w:t xml:space="preserve"> 1</w:t>
+      </w:r>
+    </w:p>
+    <w:p>
+      <w:r>
+        <w:t xml:space="preserve"> router-id 6.6.6.6</w:t>
+      </w:r>
+    </w:p>
+    <w:p>
+      <w:r>
+        <w:t xml:space="preserve"> network 10.99.1.0 0.0.0.3 area 0</w:t>
+      </w:r>
+    </w:p>
+    <w:p>
+      <w:r>
+        <w:t xml:space="preserve"> network 10.99.2.0 0.0.0.3 area 0</w:t>
+      </w:r>
+    </w:p>
+    <w:p>
+      <w:r>
+        <w:t xml:space="preserve"> network 10.1.66.1 0.0.0.0 area 0</w:t>
+      </w:r>
+    </w:p>
+    <w:p>
+      <w:r>
+        <w:t>end</w:t>
+      </w:r>
+    </w:p>
+    <w:p>
+      <w:r>
+        <w:t>copy running-config startup-config</w:t>
+      </w:r>
+    </w:p>
+    <w:p/>
+    <w:p/>
+    <w:p>
+      <w:r>
+        <w:t>--------------------------------------------------------------------</w:t>
+      </w:r>
+    </w:p>
+    <w:p>
+      <w:r>
+        <w:t>ROUTER 7 (IOU7)</w:t>
+      </w:r>
+    </w:p>
+    <w:p>
+      <w:r>
+        <w:t>--------------------------------------------------------------------</w:t>
+      </w:r>
+    </w:p>
+    <w:p>
+      <w:r>
+        <w:t>enable</w:t>
+      </w:r>
+    </w:p>
+    <w:p>
+      <w:r>
+        <w:t>configure terminal</w:t>
+      </w:r>
+    </w:p>
+    <w:p>
+      <w:r>
+        <w:t>hostname IOU7</w:t>
+      </w:r>
+    </w:p>
+    <w:p/>
+    <w:p>
+      <w:r>
+        <w:t>interface Loopback0</w:t>
+      </w:r>
+    </w:p>
+    <w:p>
+      <w:r>
+        <w:t xml:space="preserve"> </w:t>
+      </w:r>
+      <w:proofErr w:type="spellStart"/>
+      <w:r>
+        <w:t>ip</w:t>
+      </w:r>
+      <w:proofErr w:type="spellEnd"/>
+      <w:r>
+        <w:t xml:space="preserve"> address 10.1.77.1 255.255.255.255</w:t>
+      </w:r>
+    </w:p>
+    <w:p>
+      <w:r>
+        <w:t xml:space="preserve"> no shutdown</w:t>
+      </w:r>
+    </w:p>
+    <w:p/>
+    <w:p>
+      <w:r>
+        <w:t>interface Serial0/3/0</w:t>
+      </w:r>
+    </w:p>
+    <w:p>
+      <w:r>
+        <w:t xml:space="preserve"> </w:t>
+      </w:r>
+      <w:proofErr w:type="spellStart"/>
+      <w:r>
+        <w:t>ip</w:t>
+      </w:r>
+      <w:proofErr w:type="spellEnd"/>
+      <w:r>
+        <w:t xml:space="preserve"> address 10.99.2.2 255.255.255.252</w:t>
+      </w:r>
+    </w:p>
+    <w:p>
+      <w:r>
+        <w:t xml:space="preserve"> no shutdown</w:t>
+      </w:r>
+    </w:p>
+    <w:p/>
+    <w:p>
+      <w:r>
+        <w:t>interface Serial0/3/1</w:t>
+      </w:r>
+    </w:p>
+    <w:p>
+      <w:r>
+        <w:t xml:space="preserve"> </w:t>
+      </w:r>
+      <w:proofErr w:type="spellStart"/>
+      <w:r>
+        <w:t>ip</w:t>
+      </w:r>
+      <w:proofErr w:type="spellEnd"/>
+      <w:r>
+        <w:t xml:space="preserve"> address 10.99.3.1 255.255.255.252</w:t>
+      </w:r>
+    </w:p>
+    <w:p>
+      <w:r>
+        <w:t xml:space="preserve"> no shutdown</w:t>
+      </w:r>
+    </w:p>
+    <w:p/>
+    <w:p>
+      <w:proofErr w:type="spellStart"/>
+      <w:r>
+        <w:t>ip</w:t>
+      </w:r>
+      <w:proofErr w:type="spellEnd"/>
+      <w:r>
+        <w:t xml:space="preserve"> route 0.0.0.0 0.0.0.0 Serial0/3/1</w:t>
+      </w:r>
+    </w:p>
+    <w:p/>
+    <w:p>
+      <w:r>
+        <w:t xml:space="preserve">router </w:t>
+      </w:r>
+      <w:proofErr w:type="spellStart"/>
+      <w:r>
+        <w:t>ospf</w:t>
+      </w:r>
+      <w:proofErr w:type="spellEnd"/>
+      <w:r>
+        <w:t xml:space="preserve"> 1</w:t>
+      </w:r>
+    </w:p>
+    <w:p>
+      <w:r>
+        <w:t xml:space="preserve"> router-id 7.7.7.7</w:t>
+      </w:r>
+    </w:p>
+    <w:p>
+      <w:r>
+        <w:t xml:space="preserve"> default-information originate</w:t>
+      </w:r>
+    </w:p>
+    <w:p>
+      <w:r>
+        <w:t xml:space="preserve"> network 10.99.2.0 0.0.0.3 area 0</w:t>
+      </w:r>
+    </w:p>
+    <w:p>
+      <w:r>
+        <w:t xml:space="preserve"> network 10.1.77.1 0.0.0.0 area 0</w:t>
+      </w:r>
+    </w:p>
+    <w:p>
+      <w:r>
+        <w:t>end</w:t>
+      </w:r>
+    </w:p>
+    <w:p>
+      <w:r>
+        <w:t>copy running-config startup-config</w:t>
+      </w:r>
+    </w:p>
+    <w:p/>
+    <w:p/>
+    <w:p>
+      <w:r>
+        <w:t>--------------------------------------------------------------------</w:t>
+      </w:r>
+    </w:p>
+    <w:p>
+      <w:r>
+        <w:t>ROUTER 8 (IOU8)</w:t>
+      </w:r>
+    </w:p>
+    <w:p>
+      <w:r>
+        <w:t>--------------------------------------------------------------------</w:t>
+      </w:r>
+    </w:p>
+    <w:p>
+      <w:r>
+        <w:t>enable</w:t>
+      </w:r>
+    </w:p>
+    <w:p>
+      <w:r>
+        <w:t>configure terminal</w:t>
+      </w:r>
+    </w:p>
+    <w:p>
+      <w:r>
+        <w:t>hostname IOU8</w:t>
+      </w:r>
+    </w:p>
+    <w:p/>
+    <w:p>
+      <w:r>
+        <w:t>interface Loopback0</w:t>
+      </w:r>
+    </w:p>
+    <w:p>
+      <w:r>
+        <w:t xml:space="preserve"> </w:t>
+      </w:r>
+      <w:proofErr w:type="spellStart"/>
+      <w:r>
+        <w:t>ip</w:t>
+      </w:r>
+      <w:proofErr w:type="spellEnd"/>
+      <w:r>
+        <w:t xml:space="preserve"> address 10.1.88.1 255.255.255.255</w:t>
+      </w:r>
+    </w:p>
+    <w:p>
+      <w:r>
+        <w:t xml:space="preserve"> no shutdown</w:t>
+      </w:r>
+    </w:p>
+    <w:p/>
+    <w:p>
+      <w:r>
+        <w:t>interface Serial0/3/0</w:t>
+      </w:r>
+    </w:p>
+    <w:p>
+      <w:r>
+        <w:t xml:space="preserve"> </w:t>
+      </w:r>
+      <w:proofErr w:type="spellStart"/>
+      <w:r>
+        <w:t>ip</w:t>
+      </w:r>
+      <w:proofErr w:type="spellEnd"/>
+      <w:r>
+        <w:t xml:space="preserve"> address 10.99.3.2 255.255.255.252</w:t>
+      </w:r>
+    </w:p>
+    <w:p>
+      <w:r>
+        <w:t xml:space="preserve"> no shutdown</w:t>
+      </w:r>
+    </w:p>
+    <w:p>
+      <w:r>
+        <w:t>end</w:t>
+      </w:r>
+    </w:p>
+    <w:p>
+      <w:r>
+        <w:t>copy running-config startup-config</w:t>
       </w:r>
     </w:p>
     <w:sectPr>

</xml_diff>